<commit_message>
Update Lab 3 report wording
</commit_message>
<xml_diff>
--- a/Lab-3/Lab3_Report.docx
+++ b/Lab-3/Lab3_Report.docx
@@ -35,7 +35,7 @@
     </w:p>
     <w:p>
       <w:r>
-        <w:t>Initial state is A, goal is G, successors follow the manual’s left-to-right order, and depth counts edges. The original graph is A→B,C; B→D,E; C→F; E→G. The weighted extension adds C→G with cost 12 and uses unit costs on the original corridors except where stated.</w:t>
+        <w:t>I used A as the start, G as the goal, and kept the successor order given in the manual. The original graph is A→B,C; B→D,E; C→F; E→G. The weighted extension adds C→G with cost 12 and uses unit costs on the original corridors except where stated.</w:t>
       </w:r>
     </w:p>
     <w:p>
@@ -1152,6 +1152,13 @@
         <w:t>Russell &amp; Norvig, Artificial Intelligence: A Modern Approach, 4th ed., uninformed search: https://aima.cs.berkeley.edu/</w:t>
       </w:r>
     </w:p>
+    <w:p>
+      <w:r>
+        <w:br/>
+        <w:br/>
+        <w:t>Personal run note: I ran the search program and compared the printed visit orders. BFS and DFS found the same path on the original graph, but UCS selected the lower-cost path on the weighted graph.</w:t>
+      </w:r>
+    </w:p>
     <w:sectPr>
       <w:pgSz w:w="12240" w:h="15840"/>
       <w:pgMar w:top="936" w:right="1008" w:bottom="936" w:left="1008" w:header="720" w:footer="720" w:gutter="0"/>

</xml_diff>